<commit_message>
Agregando el video al informe tecnico
</commit_message>
<xml_diff>
--- a/Informe Tecnico/Informe Tecnico.docx
+++ b/Informe Tecnico/Informe Tecnico.docx
@@ -297,30 +297,74 @@
         </w:rPr>
         <w:t xml:space="preserve">Link del video: </w:t>
       </w:r>
-    </w:p>
-    <w:p>
-      <w:pPr>
-        <w:jc w:val="center"/>
-      </w:pPr>
-    </w:p>
-    <w:p>
-      <w:pPr>
-        <w:jc w:val="center"/>
-      </w:pPr>
-    </w:p>
-    <w:p>
-      <w:pPr>
-        <w:jc w:val="center"/>
-      </w:pPr>
-    </w:p>
-    <w:p>
-      <w:pPr>
-        <w:jc w:val="center"/>
-      </w:pPr>
-    </w:p>
-    <w:p>
-      <w:pPr>
-        <w:jc w:val="center"/>
+      <w:hyperlink r:id="rId9" w:history="1">
+        <w:r>
+          <w:rPr>
+            <w:rStyle w:val="Hipervnculo"/>
+            <w:rFonts w:ascii="Arial" w:hAnsi="Arial" w:cs="Arial"/>
+            <w:sz w:val="28"/>
+            <w:szCs w:val="28"/>
+          </w:rPr>
+          <w:t>https://youtu.be/8VshIO0qmSs?si=UiUDa-sF68qenAT2</w:t>
+        </w:r>
+      </w:hyperlink>
+    </w:p>
+    <w:p>
+      <w:pPr>
+        <w:rPr>
+          <w:rFonts w:ascii="Arial" w:hAnsi="Arial" w:cs="Arial"/>
+          <w:b/>
+          <w:sz w:val="28"/>
+          <w:szCs w:val="28"/>
+        </w:rPr>
+      </w:pPr>
+      <w:r>
+        <w:rPr>
+          <w:rFonts w:ascii="Arial" w:hAnsi="Arial" w:cs="Arial"/>
+          <w:b/>
+          <w:sz w:val="28"/>
+          <w:szCs w:val="28"/>
+        </w:rPr>
+        <w:t>Link</w:t>
+      </w:r>
+      <w:r>
+        <w:rPr>
+          <w:rFonts w:ascii="Arial" w:hAnsi="Arial" w:cs="Arial"/>
+          <w:b/>
+          <w:sz w:val="28"/>
+          <w:szCs w:val="28"/>
+        </w:rPr>
+        <w:t xml:space="preserve"> de GitHub:</w:t>
+      </w:r>
+    </w:p>
+    <w:p>
+      <w:pPr>
+        <w:rPr>
+          <w:rFonts w:ascii="Arial" w:hAnsi="Arial" w:cs="Arial"/>
+          <w:sz w:val="28"/>
+          <w:szCs w:val="28"/>
+        </w:rPr>
+      </w:pPr>
+      <w:hyperlink r:id="rId10" w:history="1">
+        <w:r>
+          <w:rPr>
+            <w:rStyle w:val="Hipervnculo"/>
+            <w:rFonts w:ascii="Arial" w:hAnsi="Arial" w:cs="Arial"/>
+            <w:sz w:val="28"/>
+            <w:szCs w:val="28"/>
+          </w:rPr>
+          <w:t>https://github.com/AlexNahuelAustin/Programacion-III-Integrador</w:t>
+        </w:r>
+      </w:hyperlink>
+    </w:p>
+    <w:p>
+      <w:pPr>
+        <w:rPr>
+          <w:rFonts w:ascii="Arial" w:hAnsi="Arial" w:cs="Arial"/>
+          <w:b/>
+          <w:sz w:val="28"/>
+          <w:szCs w:val="28"/>
+        </w:rPr>
       </w:pPr>
     </w:p>
     <w:p>
@@ -375,16 +419,27 @@
     </w:p>
     <w:p>
       <w:pPr>
-        <w:rPr>
-          <w:rFonts w:ascii="Arial" w:hAnsi="Arial" w:cs="Arial"/>
+        <w:jc w:val="center"/>
+        <w:rPr>
+          <w:rFonts w:ascii="Arial" w:hAnsi="Arial" w:cs="Arial"/>
+          <w:b/>
           <w:sz w:val="28"/>
-        </w:rPr>
-      </w:pPr>
-      <w:r>
+          <w:u w:val="single"/>
+        </w:rPr>
+      </w:pPr>
+    </w:p>
+    <w:p>
+      <w:pPr>
         <w:rPr>
           <w:rFonts w:ascii="Arial" w:hAnsi="Arial" w:cs="Arial"/>
           <w:sz w:val="28"/>
         </w:rPr>
+      </w:pPr>
+      <w:r>
+        <w:rPr>
+          <w:rFonts w:ascii="Arial" w:hAnsi="Arial" w:cs="Arial"/>
+          <w:sz w:val="28"/>
+        </w:rPr>
         <w:t xml:space="preserve">FoodStore es el sistema desarrollado como trabajo practico integrador de la materia programación III de la Universidad Tecnológica Nacional </w:t>
       </w:r>
     </w:p>
@@ -422,21 +477,7 @@
           <w:rFonts w:ascii="Arial" w:hAnsi="Arial" w:cs="Arial"/>
           <w:sz w:val="28"/>
         </w:rPr>
-        <w:t xml:space="preserve">El objetivo principal del proyecto es aplicar conceptos fundamentales de desarrollo full-stack, integrando un </w:t>
-      </w:r>
-      <w:r>
-        <w:rPr>
-          <w:rFonts w:ascii="Arial" w:hAnsi="Arial" w:cs="Arial"/>
-          <w:sz w:val="28"/>
-        </w:rPr>
-        <w:t>Frontend</w:t>
-      </w:r>
-      <w:r>
-        <w:rPr>
-          <w:rFonts w:ascii="Arial" w:hAnsi="Arial" w:cs="Arial"/>
-          <w:sz w:val="28"/>
-        </w:rPr>
-        <w:t xml:space="preserve"> interactivo y responsivo con un backend que maneje adecuadamente la lógica de negocio, validaciones y persistencia de datos. Esto incluye gestión de roles (ADMIN/USUARIO), autenticación, carrito de compras, historial de pedidos y reportes. </w:t>
+        <w:t xml:space="preserve">El objetivo principal del proyecto es aplicar conceptos fundamentales de desarrollo full-stack, integrando un Frontend interactivo y responsivo con un backend que maneje adecuadamente la lógica de negocio, validaciones y persistencia de datos. Esto incluye gestión de roles (ADMIN/USUARIO), autenticación, carrito de compras, historial de pedidos y reportes. </w:t>
       </w:r>
     </w:p>
     <w:p>
@@ -464,8 +505,10 @@
     <w:p/>
     <w:p/>
     <w:p/>
-    <w:p/>
-    <w:p/>
+    <w:p>
+      <w:bookmarkStart w:id="0" w:name="_GoBack"/>
+      <w:bookmarkEnd w:id="0"/>
+    </w:p>
     <w:p>
       <w:pPr>
         <w:jc w:val="center"/>
@@ -718,13 +761,7 @@
         <w:rPr>
           <w:rFonts w:ascii="Arial" w:hAnsi="Arial" w:cs="Arial"/>
         </w:rPr>
-        <w:t>FoodStore implementa su f</w:t>
-      </w:r>
-      <w:r>
-        <w:rPr>
-          <w:rFonts w:ascii="Arial" w:hAnsi="Arial" w:cs="Arial"/>
-        </w:rPr>
-        <w:t>rontend</w:t>
+        <w:t>FoodStore implementa su frontend</w:t>
       </w:r>
       <w:r>
         <w:rPr>
@@ -1242,19 +1279,7 @@
         <w:rPr>
           <w:rFonts w:ascii="Arial" w:hAnsi="Arial" w:cs="Arial"/>
         </w:rPr>
-        <w:t>El sistema cuenta con funcionalidades tanto en el frontend como en el backend. En el frontend, los usuarios pueden autenticarse mediante login y registro, explorar un catálogo dinámico con filtros por categorías y buscador, gestionar un carrito de compras con la posibilidad de modificar cantidades, realizar checkout con datos de entrega, y acceder al historial de pedidos. El panel administrativo proporciona un dashb</w:t>
-      </w:r>
-      <w:r>
-        <w:rPr>
-          <w:rFonts w:ascii="Arial" w:hAnsi="Arial" w:cs="Arial"/>
-        </w:rPr>
-        <w:t>oard con estadísticas y tablas de los productos, categorías y de los pedidos</w:t>
-      </w:r>
-      <w:r>
-        <w:rPr>
-          <w:rFonts w:ascii="Arial" w:hAnsi="Arial" w:cs="Arial"/>
-        </w:rPr>
-        <w:t xml:space="preserve">, con protección de rutas según rol. </w:t>
+        <w:t xml:space="preserve">El sistema cuenta con funcionalidades tanto en el frontend como en el backend. En el frontend, los usuarios pueden autenticarse mediante login y registro, explorar un catálogo dinámico con filtros por categorías y buscador, gestionar un carrito de compras con la posibilidad de modificar cantidades, realizar checkout con datos de entrega, y acceder al historial de pedidos. El panel administrativo proporciona un dashboard con estadísticas y tablas de los productos, categorías y de los pedidos, con protección de rutas según rol. </w:t>
       </w:r>
     </w:p>
     <w:p>
@@ -1547,14 +1572,7 @@
           <w:rFonts w:ascii="Arial" w:hAnsi="Arial" w:cs="Arial"/>
           <w:szCs w:val="24"/>
         </w:rPr>
-        <w:t>Manejo de CRUD</w:t>
-      </w:r>
-      <w:r>
-        <w:rPr>
-          <w:rFonts w:ascii="Arial" w:hAnsi="Arial" w:cs="Arial"/>
-          <w:szCs w:val="24"/>
-        </w:rPr>
-        <w:t xml:space="preserve"> y la creación atómica de un pedido.</w:t>
+        <w:t>Manejo de CRUD y la creación atómica de un pedido.</w:t>
       </w:r>
     </w:p>
     <w:p>
@@ -1574,14 +1592,7 @@
           <w:rFonts w:ascii="Arial" w:hAnsi="Arial" w:cs="Arial"/>
           <w:szCs w:val="24"/>
         </w:rPr>
-        <w:t>P</w:t>
-      </w:r>
-      <w:r>
-        <w:rPr>
-          <w:rFonts w:ascii="Arial" w:hAnsi="Arial" w:cs="Arial"/>
-          <w:szCs w:val="24"/>
-        </w:rPr>
-        <w:t>ersistencia de datos: Almacenamiento en H2 Database</w:t>
+        <w:t>Persistencia de datos: Almacenamiento en H2 Database</w:t>
       </w:r>
       <w:r>
         <w:rPr>
@@ -1608,24 +1619,15 @@
           <w:rFonts w:ascii="Arial" w:hAnsi="Arial" w:cs="Arial"/>
           <w:szCs w:val="24"/>
         </w:rPr>
-        <w:t>Reportes JPQL: Consultas de productos, pedidos y totales facturados</w:t>
+        <w:t>Reportes JPQL: Consultas de productos, pedidos y totales facturados.</w:t>
       </w:r>
       <w:r>
         <w:rPr>
           <w:rFonts w:ascii="Arial" w:hAnsi="Arial" w:cs="Arial"/>
           <w:szCs w:val="24"/>
         </w:rPr>
-        <w:t>.</w:t>
-      </w:r>
-      <w:r>
-        <w:rPr>
-          <w:rFonts w:ascii="Arial" w:hAnsi="Arial" w:cs="Arial"/>
-          <w:szCs w:val="24"/>
-        </w:rPr>
         <w:br/>
       </w:r>
-      <w:bookmarkStart w:id="0" w:name="_GoBack"/>
-      <w:bookmarkEnd w:id="0"/>
       <w:r>
         <w:rPr>
           <w:rFonts w:ascii="Arial" w:hAnsi="Arial" w:cs="Arial"/>
@@ -1693,62 +1695,20 @@
         <w:rPr>
           <w:rFonts w:ascii="Arial" w:hAnsi="Arial" w:cs="Arial"/>
         </w:rPr>
-        <w:t xml:space="preserve">mantenibilidad y escalabilidad sea más fácil de arreglar. En cual va a ser una aplicación desacoplada </w:t>
-      </w:r>
-      <w:r>
-        <w:rPr>
-          <w:rFonts w:ascii="Arial" w:hAnsi="Arial" w:cs="Arial"/>
-        </w:rPr>
-        <w:t>dond</w:t>
-      </w:r>
-      <w:r>
-        <w:rPr>
-          <w:rFonts w:ascii="Arial" w:hAnsi="Arial" w:cs="Arial"/>
-        </w:rPr>
-        <w:t xml:space="preserve">e frontend y backend funcionan </w:t>
-      </w:r>
-      <w:r>
-        <w:rPr>
-          <w:rFonts w:ascii="Arial" w:hAnsi="Arial" w:cs="Arial"/>
-        </w:rPr>
-        <w:t>de manera independiente, permitiendo futuras integraciones con APIs reales.</w:t>
-      </w:r>
-    </w:p>
-    <w:p>
-      <w:pPr>
-        <w:rPr>
-          <w:rFonts w:ascii="Arial" w:hAnsi="Arial" w:cs="Arial"/>
-        </w:rPr>
-      </w:pPr>
-      <w:r>
-        <w:rPr>
-          <w:rFonts w:ascii="Arial" w:hAnsi="Arial" w:cs="Arial"/>
-        </w:rPr>
-        <w:t>Se implementó un patrón de arquitectura de capas que facilita</w:t>
-      </w:r>
-      <w:r>
-        <w:rPr>
-          <w:rFonts w:ascii="Arial" w:hAnsi="Arial" w:cs="Arial"/>
-        </w:rPr>
-        <w:t xml:space="preserve"> el testing y el mantenimiento </w:t>
-      </w:r>
-      <w:r>
-        <w:rPr>
-          <w:rFonts w:ascii="Arial" w:hAnsi="Arial" w:cs="Arial"/>
-        </w:rPr>
-        <w:t>del código. En el frontend se utilizó localStorage para p</w:t>
-      </w:r>
-      <w:r>
-        <w:rPr>
-          <w:rFonts w:ascii="Arial" w:hAnsi="Arial" w:cs="Arial"/>
-        </w:rPr>
-        <w:t xml:space="preserve">ersistencia de datos, evitando </w:t>
-      </w:r>
-      <w:r>
-        <w:rPr>
-          <w:rFonts w:ascii="Arial" w:hAnsi="Arial" w:cs="Arial"/>
-        </w:rPr>
-        <w:t xml:space="preserve">complejidades iniciales. En el backend se aplicó </w:t>
+        <w:t>mantenibilidad y escalabilidad sea más fácil de arreglar. En cual va a ser una aplicación desacoplada donde frontend y backend funcionan de manera independiente, permitiendo futuras integraciones con APIs reales.</w:t>
+      </w:r>
+    </w:p>
+    <w:p>
+      <w:pPr>
+        <w:rPr>
+          <w:rFonts w:ascii="Arial" w:hAnsi="Arial" w:cs="Arial"/>
+        </w:rPr>
+      </w:pPr>
+      <w:r>
+        <w:rPr>
+          <w:rFonts w:ascii="Arial" w:hAnsi="Arial" w:cs="Arial"/>
+        </w:rPr>
+        <w:t xml:space="preserve">Se implementó un patrón de arquitectura de capas que facilita el testing y el mantenimiento del código. En el frontend se utilizó localStorage para persistencia de datos, evitando complejidades iniciales. En el backend se aplicó </w:t>
       </w:r>
       <w:r>
         <w:rPr>
@@ -1760,55 +1720,14 @@
         <w:rPr>
           <w:rFonts w:ascii="Arial" w:hAnsi="Arial" w:cs="Arial"/>
         </w:rPr>
-        <w:t xml:space="preserve"> </w:t>
-      </w:r>
-      <w:r>
-        <w:rPr>
-          <w:rFonts w:ascii="Arial" w:hAnsi="Arial" w:cs="Arial"/>
-        </w:rPr>
-        <w:t xml:space="preserve">para centralizar </w:t>
-      </w:r>
-      <w:r>
-        <w:rPr>
-          <w:rFonts w:ascii="Arial" w:hAnsi="Arial" w:cs="Arial"/>
-        </w:rPr>
-        <w:t xml:space="preserve">el acceso a datos, y se crearon </w:t>
-      </w:r>
-      <w:r>
-        <w:rPr>
-          <w:rFonts w:ascii="Arial" w:hAnsi="Arial" w:cs="Arial"/>
-        </w:rPr>
-        <w:t xml:space="preserve">excepciones personalizadas para capturar errores específicos </w:t>
-      </w:r>
-      <w:r>
-        <w:rPr>
-          <w:rFonts w:ascii="Arial" w:hAnsi="Arial" w:cs="Arial"/>
-        </w:rPr>
-        <w:t xml:space="preserve">del negocio. </w:t>
+        <w:t xml:space="preserve"> para centralizar el acceso a datos, y se crearon excepciones personalizadas para capturar errores específicos del negocio. </w:t>
       </w:r>
       <w:r>
         <w:rPr>
           <w:rFonts w:ascii="Arial" w:hAnsi="Arial" w:cs="Arial"/>
         </w:rPr>
         <w:br/>
-      </w:r>
-      <w:r>
-        <w:rPr>
-          <w:rFonts w:ascii="Arial" w:hAnsi="Arial" w:cs="Arial"/>
-        </w:rPr>
-        <w:t>Se implementó CRUD completo para usuarios, pr</w:t>
-      </w:r>
-      <w:r>
-        <w:rPr>
-          <w:rFonts w:ascii="Arial" w:hAnsi="Arial" w:cs="Arial"/>
-        </w:rPr>
-        <w:t xml:space="preserve">oductos, categorías y pedidos, </w:t>
-      </w:r>
-      <w:r>
-        <w:rPr>
-          <w:rFonts w:ascii="Arial" w:hAnsi="Arial" w:cs="Arial"/>
-        </w:rPr>
-        <w:t>validando stock y aplicando cascadas de eliminación donde corresponde.</w:t>
+        <w:t>Se implementó CRUD completo para usuarios, productos, categorías y pedidos, validando stock y aplicando cascadas de eliminación donde corresponde.</w:t>
       </w:r>
     </w:p>
     <w:p>
@@ -2315,15 +2234,7 @@
           <w:sz w:val="24"/>
         </w:rPr>
         <w:lastRenderedPageBreak/>
-        <w:t>Fuentes</w:t>
-      </w:r>
-      <w:r>
-        <w:rPr>
-          <w:rFonts w:ascii="Arial" w:hAnsi="Arial" w:cs="Arial"/>
-          <w:b/>
-          <w:sz w:val="24"/>
-        </w:rPr>
-        <w:t>:</w:t>
+        <w:t>Fuentes:</w:t>
       </w:r>
     </w:p>
     <w:p>
@@ -2344,92 +2255,6 @@
           <w:rFonts w:ascii="Arial" w:hAnsi="Arial" w:cs="Arial"/>
         </w:rPr>
         <w:t xml:space="preserve">Documentación oficial de TypeScript: </w:t>
-      </w:r>
-      <w:hyperlink r:id="rId9" w:history="1">
-        <w:r>
-          <w:rPr>
-            <w:rStyle w:val="Hipervnculo"/>
-            <w:rFonts w:ascii="Arial" w:hAnsi="Arial" w:cs="Arial"/>
-          </w:rPr>
-          <w:t>https://www</w:t>
-        </w:r>
-        <w:r>
-          <w:rPr>
-            <w:rStyle w:val="Hipervnculo"/>
-            <w:rFonts w:ascii="Arial" w:hAnsi="Arial" w:cs="Arial"/>
-          </w:rPr>
-          <w:t>.</w:t>
-        </w:r>
-        <w:r>
-          <w:rPr>
-            <w:rStyle w:val="Hipervnculo"/>
-            <w:rFonts w:ascii="Arial" w:hAnsi="Arial" w:cs="Arial"/>
-          </w:rPr>
-          <w:t>typescriptlang.org/</w:t>
-        </w:r>
-      </w:hyperlink>
-    </w:p>
-    <w:p>
-      <w:pPr>
-        <w:pStyle w:val="Prrafodelista"/>
-        <w:numPr>
-          <w:ilvl w:val="0"/>
-          <w:numId w:val="7"/>
-        </w:numPr>
-        <w:rPr>
-          <w:rFonts w:ascii="Arial" w:hAnsi="Arial" w:cs="Arial"/>
-          <w:b/>
-          <w:sz w:val="24"/>
-        </w:rPr>
-      </w:pPr>
-      <w:r>
-        <w:rPr>
-          <w:rFonts w:ascii="Arial" w:hAnsi="Arial" w:cs="Arial"/>
-        </w:rPr>
-        <w:t xml:space="preserve">Documentación oficial de Vite: </w:t>
-      </w:r>
-      <w:hyperlink r:id="rId10" w:history="1">
-        <w:r>
-          <w:rPr>
-            <w:rStyle w:val="Hipervnculo"/>
-            <w:rFonts w:ascii="Arial" w:hAnsi="Arial" w:cs="Arial"/>
-          </w:rPr>
-          <w:t>https://vit</w:t>
-        </w:r>
-        <w:r>
-          <w:rPr>
-            <w:rStyle w:val="Hipervnculo"/>
-            <w:rFonts w:ascii="Arial" w:hAnsi="Arial" w:cs="Arial"/>
-          </w:rPr>
-          <w:t>e</w:t>
-        </w:r>
-        <w:r>
-          <w:rPr>
-            <w:rStyle w:val="Hipervnculo"/>
-            <w:rFonts w:ascii="Arial" w:hAnsi="Arial" w:cs="Arial"/>
-          </w:rPr>
-          <w:t>js.dev/</w:t>
-        </w:r>
-      </w:hyperlink>
-    </w:p>
-    <w:p>
-      <w:pPr>
-        <w:pStyle w:val="Prrafodelista"/>
-        <w:numPr>
-          <w:ilvl w:val="0"/>
-          <w:numId w:val="7"/>
-        </w:numPr>
-        <w:rPr>
-          <w:rFonts w:ascii="Arial" w:hAnsi="Arial" w:cs="Arial"/>
-          <w:b/>
-          <w:sz w:val="24"/>
-        </w:rPr>
-      </w:pPr>
-      <w:r>
-        <w:rPr>
-          <w:rFonts w:ascii="Arial" w:hAnsi="Arial" w:cs="Arial"/>
-        </w:rPr>
-        <w:t xml:space="preserve">Documentación oficial de Java: </w:t>
       </w:r>
       <w:hyperlink r:id="rId11" w:history="1">
         <w:r>
@@ -2437,21 +2262,7 @@
             <w:rStyle w:val="Hipervnculo"/>
             <w:rFonts w:ascii="Arial" w:hAnsi="Arial" w:cs="Arial"/>
           </w:rPr>
-          <w:t>https://docs.ora</w:t>
-        </w:r>
-        <w:r>
-          <w:rPr>
-            <w:rStyle w:val="Hipervnculo"/>
-            <w:rFonts w:ascii="Arial" w:hAnsi="Arial" w:cs="Arial"/>
-          </w:rPr>
-          <w:t>c</w:t>
-        </w:r>
-        <w:r>
-          <w:rPr>
-            <w:rStyle w:val="Hipervnculo"/>
-            <w:rFonts w:ascii="Arial" w:hAnsi="Arial" w:cs="Arial"/>
-          </w:rPr>
-          <w:t>le.com/en/java/</w:t>
+          <w:t>https://www.typescriptlang.org/</w:t>
         </w:r>
       </w:hyperlink>
     </w:p>
@@ -2472,7 +2283,7 @@
         <w:rPr>
           <w:rFonts w:ascii="Arial" w:hAnsi="Arial" w:cs="Arial"/>
         </w:rPr>
-        <w:t xml:space="preserve">Documentación oficial de Hibernate: </w:t>
+        <w:t xml:space="preserve">Documentación oficial de Vite: </w:t>
       </w:r>
       <w:hyperlink r:id="rId12" w:history="1">
         <w:r>
@@ -2480,21 +2291,65 @@
             <w:rStyle w:val="Hipervnculo"/>
             <w:rFonts w:ascii="Arial" w:hAnsi="Arial" w:cs="Arial"/>
           </w:rPr>
-          <w:t>https://hiberna</w:t>
+          <w:t>https://vitejs.dev/</w:t>
         </w:r>
+      </w:hyperlink>
+    </w:p>
+    <w:p>
+      <w:pPr>
+        <w:pStyle w:val="Prrafodelista"/>
+        <w:numPr>
+          <w:ilvl w:val="0"/>
+          <w:numId w:val="7"/>
+        </w:numPr>
+        <w:rPr>
+          <w:rFonts w:ascii="Arial" w:hAnsi="Arial" w:cs="Arial"/>
+          <w:b/>
+          <w:sz w:val="24"/>
+        </w:rPr>
+      </w:pPr>
+      <w:r>
+        <w:rPr>
+          <w:rFonts w:ascii="Arial" w:hAnsi="Arial" w:cs="Arial"/>
+        </w:rPr>
+        <w:t xml:space="preserve">Documentación oficial de Java: </w:t>
+      </w:r>
+      <w:hyperlink r:id="rId13" w:history="1">
         <w:r>
           <w:rPr>
             <w:rStyle w:val="Hipervnculo"/>
             <w:rFonts w:ascii="Arial" w:hAnsi="Arial" w:cs="Arial"/>
           </w:rPr>
-          <w:t>t</w:t>
+          <w:t>https://docs.oracle.com/en/java/</w:t>
         </w:r>
+      </w:hyperlink>
+    </w:p>
+    <w:p>
+      <w:pPr>
+        <w:pStyle w:val="Prrafodelista"/>
+        <w:numPr>
+          <w:ilvl w:val="0"/>
+          <w:numId w:val="7"/>
+        </w:numPr>
+        <w:rPr>
+          <w:rFonts w:ascii="Arial" w:hAnsi="Arial" w:cs="Arial"/>
+          <w:b/>
+          <w:sz w:val="24"/>
+        </w:rPr>
+      </w:pPr>
+      <w:r>
+        <w:rPr>
+          <w:rFonts w:ascii="Arial" w:hAnsi="Arial" w:cs="Arial"/>
+        </w:rPr>
+        <w:t xml:space="preserve">Documentación oficial de Hibernate: </w:t>
+      </w:r>
+      <w:hyperlink r:id="rId14" w:history="1">
         <w:r>
           <w:rPr>
             <w:rStyle w:val="Hipervnculo"/>
             <w:rFonts w:ascii="Arial" w:hAnsi="Arial" w:cs="Arial"/>
           </w:rPr>
-          <w:t>e.org/</w:t>
+          <w:t>https://hibernate.org/</w:t>
         </w:r>
       </w:hyperlink>
     </w:p>
@@ -2517,7 +2372,7 @@
         </w:rPr>
         <w:t xml:space="preserve">Documentación oficial de Lombok: </w:t>
       </w:r>
-      <w:hyperlink r:id="rId13" w:history="1">
+      <w:hyperlink r:id="rId15" w:history="1">
         <w:r>
           <w:rPr>
             <w:rStyle w:val="Hipervnculo"/>
@@ -2538,7 +2393,7 @@
           <w:rFonts w:ascii="Arial" w:hAnsi="Arial" w:cs="Arial"/>
         </w:rPr>
       </w:pPr>
-      <w:hyperlink r:id="rId14" w:history="1">
+      <w:hyperlink r:id="rId16" w:history="1">
         <w:r>
           <w:rPr>
             <w:rStyle w:val="Hipervnculo"/>

</xml_diff>